<commit_message>
Updating the formating of the docx document
Updated the formatting of the doc file so stand alone
</commit_message>
<xml_diff>
--- a/FAOMMSY_Draft_Toolbox_R_scripts.docx
+++ b/FAOMMSY_Draft_Toolbox_R_scripts.docx
@@ -10,32 +10,9 @@
           <w:numId w:val="0"/>
         </w:numPr>
       </w:pPr>
-      <w:bookmarkStart w:id="0" w:name="_Annex_-_R"/>
-      <w:bookmarkStart w:id="1" w:name="_Toc111145745"/>
-      <w:bookmarkStart w:id="2" w:name="_Ref111151963"/>
-      <w:bookmarkStart w:id="3" w:name="_Toc121131650"/>
-      <w:bookmarkEnd w:id="0"/>
-      <w:r>
-        <w:t>C</w:t>
-      </w:r>
-      <w:r>
-        <w:tab/>
-      </w:r>
-      <w:r>
-        <w:t xml:space="preserve">Annex </w:t>
-      </w:r>
-      <w:r>
-        <w:t>–</w:t>
-      </w:r>
-      <w:r>
-        <w:t xml:space="preserve"> </w:t>
-      </w:r>
-      <w:r>
-        <w:t>R scripts</w:t>
-      </w:r>
-      <w:bookmarkEnd w:id="1"/>
-      <w:bookmarkEnd w:id="2"/>
-      <w:bookmarkEnd w:id="3"/>
+      <w:r>
+        <w:t>Guidance on technical steps for analysing multispecies data</w:t>
+      </w:r>
     </w:p>
     <w:p>
       <w:pPr>
@@ -58,22 +35,6 @@
           <w:sz w:val="24"/>
         </w:rPr>
       </w:pPr>
-      <w:r>
-        <w:rPr>
-          <w:rFonts w:asciiTheme="minorHAnsi" w:hAnsiTheme="minorHAnsi" w:cstheme="minorHAnsi"/>
-          <w:b/>
-          <w:sz w:val="24"/>
-        </w:rPr>
-        <w:t xml:space="preserve">BOX </w:t>
-      </w:r>
-      <w:r>
-        <w:rPr>
-          <w:rFonts w:asciiTheme="minorHAnsi" w:hAnsiTheme="minorHAnsi" w:cstheme="minorHAnsi"/>
-          <w:b/>
-          <w:sz w:val="24"/>
-        </w:rPr>
-        <w:t>C.</w:t>
-      </w:r>
       <w:r>
         <w:rPr>
           <w:rFonts w:asciiTheme="minorHAnsi" w:hAnsiTheme="minorHAnsi" w:cstheme="minorHAnsi"/>
@@ -11206,22 +11167,6 @@
           <w:sz w:val="24"/>
         </w:rPr>
         <w:lastRenderedPageBreak/>
-        <w:t xml:space="preserve">BOX </w:t>
-      </w:r>
-      <w:r>
-        <w:rPr>
-          <w:rFonts w:asciiTheme="minorHAnsi" w:hAnsiTheme="minorHAnsi" w:cstheme="minorHAnsi"/>
-          <w:b/>
-          <w:sz w:val="24"/>
-        </w:rPr>
-        <w:t>C.</w:t>
-      </w:r>
-      <w:r>
-        <w:rPr>
-          <w:rFonts w:asciiTheme="minorHAnsi" w:hAnsiTheme="minorHAnsi" w:cstheme="minorHAnsi"/>
-          <w:b/>
-          <w:sz w:val="24"/>
-        </w:rPr>
         <w:t>2: Cluster analyses</w:t>
       </w:r>
     </w:p>
@@ -13222,22 +13167,6 @@
           <w:b/>
           <w:sz w:val="24"/>
         </w:rPr>
-        <w:t xml:space="preserve">BOX </w:t>
-      </w:r>
-      <w:r>
-        <w:rPr>
-          <w:rFonts w:asciiTheme="minorHAnsi" w:hAnsiTheme="minorHAnsi" w:cstheme="minorHAnsi"/>
-          <w:b/>
-          <w:sz w:val="24"/>
-        </w:rPr>
-        <w:t>C.</w:t>
-      </w:r>
-      <w:r>
-        <w:rPr>
-          <w:rFonts w:asciiTheme="minorHAnsi" w:hAnsiTheme="minorHAnsi" w:cstheme="minorHAnsi"/>
-          <w:b/>
-          <w:sz w:val="24"/>
-        </w:rPr>
         <w:t>3: Principal component analyses</w:t>
       </w:r>
     </w:p>
@@ -20055,11 +19984,6 @@
     <w:p>
       <w:pPr>
         <w:spacing w:after="160"/>
-        <w:rPr>
-          <w:rFonts w:asciiTheme="minorHAnsi" w:hAnsiTheme="minorHAnsi" w:cstheme="minorHAnsi"/>
-          <w:color w:val="1F4E79"/>
-          <w:sz w:val="24"/>
-        </w:rPr>
       </w:pPr>
       <w:proofErr w:type="spellStart"/>
       <w:proofErr w:type="gramStart"/>
@@ -20189,1972 +20113,16 @@
         </w:rPr>
         <w:t>=0.4)</w:t>
       </w:r>
-    </w:p>
-    <w:p>
-      <w:pPr>
-        <w:pBdr>
-          <w:bottom w:val="single" w:sz="6" w:space="1" w:color="000000"/>
-        </w:pBdr>
-        <w:sectPr>
-          <w:pgSz w:w="16838" w:h="11906" w:orient="landscape"/>
-          <w:pgMar w:top="1440" w:right="1440" w:bottom="1440" w:left="1440" w:header="708" w:footer="708" w:gutter="0"/>
-          <w:cols w:space="720"/>
-        </w:sectPr>
-      </w:pPr>
-    </w:p>
-    <w:p>
-      <w:pPr>
-        <w:pStyle w:val="Heading1"/>
-        <w:numPr>
-          <w:ilvl w:val="0"/>
-          <w:numId w:val="0"/>
-        </w:numPr>
-      </w:pPr>
-      <w:bookmarkStart w:id="4" w:name="_Toc111145746"/>
-      <w:bookmarkStart w:id="5" w:name="_Toc121131651"/>
-      <w:r>
-        <w:lastRenderedPageBreak/>
-        <w:t>D</w:t>
-      </w:r>
-      <w:r>
-        <w:tab/>
-      </w:r>
-      <w:r>
-        <w:t xml:space="preserve">References used in the </w:t>
-      </w:r>
-      <w:r>
-        <w:t>Technical guidance</w:t>
-      </w:r>
-      <w:bookmarkEnd w:id="4"/>
-      <w:bookmarkEnd w:id="5"/>
-    </w:p>
-    <w:p>
-      <w:pPr>
-        <w:rPr>
-          <w:lang w:eastAsia="en-AU"/>
-        </w:rPr>
-      </w:pPr>
-    </w:p>
-    <w:p>
-      <w:pPr>
-        <w:pBdr>
-          <w:top w:val="nil"/>
-          <w:left w:val="nil"/>
-          <w:bottom w:val="nil"/>
-          <w:right w:val="nil"/>
-          <w:between w:val="nil"/>
-        </w:pBdr>
-        <w:ind w:left="720" w:hanging="720"/>
-        <w:rPr>
-          <w:color w:val="000000"/>
-        </w:rPr>
-      </w:pPr>
-      <w:r>
-        <w:rPr>
-          <w:color w:val="000000"/>
-        </w:rPr>
-        <w:t xml:space="preserve">Ainsworth, C. H. 2011. Quantifying Species Abundance Trends in the Northern Gulf of California Using Local Ecological Knowledge. </w:t>
-      </w:r>
-      <w:r>
-        <w:rPr>
-          <w:i/>
-          <w:color w:val="000000"/>
-        </w:rPr>
-        <w:t>Marine and Coastal Fisheries,</w:t>
-      </w:r>
-      <w:r>
-        <w:rPr>
-          <w:color w:val="000000"/>
-        </w:rPr>
-        <w:t xml:space="preserve"> 3</w:t>
-      </w:r>
-      <w:r>
-        <w:rPr>
-          <w:b/>
-          <w:color w:val="000000"/>
-        </w:rPr>
-        <w:t>,</w:t>
-      </w:r>
-      <w:r>
-        <w:rPr>
-          <w:color w:val="000000"/>
-        </w:rPr>
-        <w:t xml:space="preserve"> 190-218.</w:t>
-      </w:r>
-    </w:p>
-    <w:p>
-      <w:pPr>
-        <w:pBdr>
-          <w:top w:val="nil"/>
-          <w:left w:val="nil"/>
-          <w:bottom w:val="nil"/>
-          <w:right w:val="nil"/>
-          <w:between w:val="nil"/>
-        </w:pBdr>
-        <w:ind w:left="720" w:hanging="720"/>
-        <w:rPr>
-          <w:color w:val="000000"/>
-        </w:rPr>
-      </w:pPr>
-      <w:r>
-        <w:rPr>
-          <w:color w:val="000000"/>
-        </w:rPr>
-        <w:t xml:space="preserve">Anh, P. V., Laender, F. D., Everaert, G., Vinh, C. T. &amp; Goethals, P. 2014. An integrated food web model to test the impact of fisheries management scenarios on the coastal ecosystem of Vietnam. </w:t>
-      </w:r>
-      <w:r>
-        <w:rPr>
-          <w:i/>
-          <w:color w:val="000000"/>
-        </w:rPr>
-        <w:t>Ocean &amp; Coastal Management,</w:t>
-      </w:r>
-      <w:r>
-        <w:rPr>
-          <w:color w:val="000000"/>
-        </w:rPr>
-        <w:t xml:space="preserve"> 92</w:t>
-      </w:r>
-      <w:r>
-        <w:rPr>
-          <w:b/>
-          <w:color w:val="000000"/>
-        </w:rPr>
-        <w:t>,</w:t>
-      </w:r>
-      <w:r>
-        <w:rPr>
-          <w:color w:val="000000"/>
-        </w:rPr>
-        <w:t xml:space="preserve"> 74--86.</w:t>
-      </w:r>
-    </w:p>
-    <w:p>
-      <w:pPr>
-        <w:pBdr>
-          <w:top w:val="nil"/>
-          <w:left w:val="nil"/>
-          <w:bottom w:val="nil"/>
-          <w:right w:val="nil"/>
-          <w:between w:val="nil"/>
-        </w:pBdr>
-        <w:ind w:left="720" w:hanging="720"/>
-        <w:rPr>
-          <w:color w:val="000000"/>
-        </w:rPr>
-      </w:pPr>
-      <w:r>
-        <w:rPr>
-          <w:color w:val="000000"/>
-        </w:rPr>
-        <w:t xml:space="preserve">Ainsworth, C. H. &amp; Walters, C. J. 2015. Ten common mistakes made in </w:t>
-      </w:r>
-      <w:proofErr w:type="spellStart"/>
-      <w:r>
-        <w:rPr>
-          <w:color w:val="000000"/>
-        </w:rPr>
-        <w:t>Ecopath</w:t>
-      </w:r>
-      <w:proofErr w:type="spellEnd"/>
-      <w:r>
-        <w:rPr>
-          <w:color w:val="000000"/>
-        </w:rPr>
-        <w:t xml:space="preserve"> with </w:t>
-      </w:r>
-      <w:proofErr w:type="spellStart"/>
-      <w:r>
-        <w:rPr>
-          <w:color w:val="000000"/>
-        </w:rPr>
-        <w:t>Ecosim</w:t>
-      </w:r>
-      <w:proofErr w:type="spellEnd"/>
-      <w:r>
-        <w:rPr>
-          <w:color w:val="000000"/>
-        </w:rPr>
-        <w:t xml:space="preserve"> modelling. </w:t>
-      </w:r>
-      <w:r>
-        <w:rPr>
-          <w:i/>
-          <w:color w:val="000000"/>
-        </w:rPr>
-        <w:t>Ecological Modelling,</w:t>
-      </w:r>
-      <w:r>
-        <w:rPr>
-          <w:color w:val="000000"/>
-        </w:rPr>
-        <w:t xml:space="preserve"> 308</w:t>
-      </w:r>
-      <w:r>
-        <w:rPr>
-          <w:b/>
-          <w:color w:val="000000"/>
-        </w:rPr>
-        <w:t>,</w:t>
-      </w:r>
-      <w:r>
-        <w:rPr>
-          <w:color w:val="000000"/>
-        </w:rPr>
-        <w:t xml:space="preserve"> 14-17.</w:t>
-      </w:r>
-    </w:p>
-    <w:p>
-      <w:pPr>
-        <w:widowControl w:val="0"/>
-        <w:ind w:left="709" w:hanging="709"/>
-      </w:pPr>
-      <w:r>
-        <w:t>Banse, K. &amp; Mosher, S. 1980. Adult Body Mass and Annual Production/Biomass</w:t>
-      </w:r>
       <w:r>
         <w:t xml:space="preserve"> </w:t>
       </w:r>
-      <w:r>
-        <w:t xml:space="preserve">Relationships of Field Populations. </w:t>
-      </w:r>
-      <w:r>
-        <w:rPr>
-          <w:i/>
-        </w:rPr>
-        <w:t>Ecological Monographs,</w:t>
-      </w:r>
-      <w:r>
-        <w:t xml:space="preserve"> 50</w:t>
-      </w:r>
-      <w:r>
-        <w:rPr>
-          <w:b/>
-        </w:rPr>
-        <w:t>,</w:t>
-      </w:r>
-      <w:r>
-        <w:t xml:space="preserve"> 355-379.</w:t>
-      </w:r>
-    </w:p>
-    <w:p>
-      <w:pPr>
-        <w:pBdr>
-          <w:top w:val="nil"/>
-          <w:left w:val="nil"/>
-          <w:bottom w:val="nil"/>
-          <w:right w:val="nil"/>
-          <w:between w:val="nil"/>
-        </w:pBdr>
-        <w:ind w:left="720" w:hanging="720"/>
-        <w:rPr>
-          <w:color w:val="000000"/>
-        </w:rPr>
-      </w:pPr>
-      <w:r>
-        <w:rPr>
-          <w:color w:val="000000"/>
-        </w:rPr>
-        <w:t xml:space="preserve">Bates, D., </w:t>
-      </w:r>
-      <w:proofErr w:type="spellStart"/>
-      <w:r>
-        <w:rPr>
-          <w:color w:val="000000"/>
-        </w:rPr>
-        <w:t>McHler</w:t>
-      </w:r>
-      <w:proofErr w:type="spellEnd"/>
-      <w:r>
-        <w:rPr>
-          <w:color w:val="000000"/>
-        </w:rPr>
-        <w:t xml:space="preserve">, M., Bolker, B. &amp; Walker, S. 2015. Fitting Linear Mixed-Effects Models Usinglme4. </w:t>
-      </w:r>
-      <w:r>
-        <w:rPr>
-          <w:i/>
-          <w:color w:val="000000"/>
-        </w:rPr>
-        <w:t>Journal of Statistical Software,</w:t>
-      </w:r>
-      <w:r>
-        <w:rPr>
-          <w:color w:val="000000"/>
-        </w:rPr>
-        <w:t xml:space="preserve"> 67.</w:t>
-      </w:r>
-    </w:p>
-    <w:p>
-      <w:pPr>
-        <w:pBdr>
-          <w:top w:val="nil"/>
-          <w:left w:val="nil"/>
-          <w:bottom w:val="nil"/>
-          <w:right w:val="nil"/>
-          <w:between w:val="nil"/>
-        </w:pBdr>
-        <w:ind w:left="720" w:hanging="720"/>
-        <w:rPr>
-          <w:color w:val="000000"/>
-        </w:rPr>
-      </w:pPr>
-      <w:proofErr w:type="spellStart"/>
-      <w:r>
-        <w:rPr>
-          <w:color w:val="000000"/>
-        </w:rPr>
-        <w:t>Blueweiss</w:t>
-      </w:r>
-      <w:proofErr w:type="spellEnd"/>
-      <w:r>
-        <w:rPr>
-          <w:color w:val="000000"/>
-        </w:rPr>
-        <w:t xml:space="preserve">, L., Fox, H., Kudzma, V., Nakashima, D., Peters, R. &amp; Sams, S. 1978. Relationships between body size and some life history parameters. </w:t>
-      </w:r>
-      <w:proofErr w:type="spellStart"/>
-      <w:r>
-        <w:rPr>
-          <w:i/>
-          <w:color w:val="000000"/>
-        </w:rPr>
-        <w:t>Oecologia</w:t>
-      </w:r>
-      <w:proofErr w:type="spellEnd"/>
-      <w:r>
-        <w:rPr>
-          <w:i/>
-          <w:color w:val="000000"/>
-        </w:rPr>
-        <w:t>,</w:t>
-      </w:r>
-      <w:r>
-        <w:rPr>
-          <w:color w:val="000000"/>
-        </w:rPr>
-        <w:t xml:space="preserve"> 37</w:t>
-      </w:r>
-      <w:r>
-        <w:rPr>
-          <w:b/>
-          <w:color w:val="000000"/>
-        </w:rPr>
-        <w:t>,</w:t>
-      </w:r>
-      <w:r>
-        <w:rPr>
-          <w:color w:val="000000"/>
-        </w:rPr>
-        <w:t xml:space="preserve"> 257-272.</w:t>
-      </w:r>
-    </w:p>
-    <w:p>
-      <w:pPr>
-        <w:pBdr>
-          <w:top w:val="nil"/>
-          <w:left w:val="nil"/>
-          <w:bottom w:val="nil"/>
-          <w:right w:val="nil"/>
-          <w:between w:val="nil"/>
-        </w:pBdr>
-        <w:ind w:left="720" w:hanging="720"/>
-        <w:rPr>
-          <w:color w:val="000000"/>
-        </w:rPr>
-      </w:pPr>
-      <w:r>
-        <w:rPr>
-          <w:color w:val="000000"/>
-        </w:rPr>
-        <w:t xml:space="preserve">Branch, T. A., Watson, R., Fulton, E., Jennings, S., McGilliard, C. R., Pablico, G. T., Ricard, D. &amp; Tracey, S. R. 2010. The trophic fingerprint of marine fisheries. </w:t>
-      </w:r>
-      <w:r>
-        <w:rPr>
-          <w:i/>
-          <w:color w:val="000000"/>
-        </w:rPr>
-        <w:t>Nature,</w:t>
-      </w:r>
-      <w:r>
-        <w:rPr>
-          <w:color w:val="000000"/>
-        </w:rPr>
-        <w:t xml:space="preserve"> 468</w:t>
-      </w:r>
-      <w:r>
-        <w:rPr>
-          <w:b/>
-          <w:color w:val="000000"/>
-        </w:rPr>
-        <w:t>,</w:t>
-      </w:r>
-      <w:r>
-        <w:rPr>
-          <w:color w:val="000000"/>
-        </w:rPr>
-        <w:t xml:space="preserve"> 431-435.</w:t>
-      </w:r>
-    </w:p>
-    <w:p>
-      <w:pPr>
-        <w:pBdr>
-          <w:top w:val="nil"/>
-          <w:left w:val="nil"/>
-          <w:bottom w:val="nil"/>
-          <w:right w:val="nil"/>
-          <w:between w:val="nil"/>
-        </w:pBdr>
-        <w:ind w:left="720" w:hanging="720"/>
-        <w:rPr>
-          <w:color w:val="000000"/>
-        </w:rPr>
-      </w:pPr>
-      <w:r>
-        <w:rPr>
-          <w:color w:val="000000"/>
-        </w:rPr>
-        <w:t xml:space="preserve">Briton, F., Shannon, L., Barrier, N., Verley, P. &amp; Shin, Y.-J. 2019. Reference levels of ecosystem indicators at multispecies maximum sustainable yield. </w:t>
-      </w:r>
-      <w:r>
-        <w:rPr>
-          <w:i/>
-          <w:color w:val="000000"/>
-        </w:rPr>
-        <w:t>ICES Journal of Marine Science,</w:t>
-      </w:r>
-      <w:r>
-        <w:rPr>
-          <w:color w:val="000000"/>
-        </w:rPr>
-        <w:t xml:space="preserve"> 76</w:t>
-      </w:r>
-      <w:r>
-        <w:rPr>
-          <w:b/>
-          <w:color w:val="000000"/>
-        </w:rPr>
-        <w:t>,</w:t>
-      </w:r>
-      <w:r>
-        <w:rPr>
-          <w:color w:val="000000"/>
-        </w:rPr>
-        <w:t xml:space="preserve"> 2070-2081.</w:t>
-      </w:r>
-    </w:p>
-    <w:p>
-      <w:pPr>
-        <w:pBdr>
-          <w:top w:val="nil"/>
-          <w:left w:val="nil"/>
-          <w:bottom w:val="nil"/>
-          <w:right w:val="nil"/>
-          <w:between w:val="nil"/>
-        </w:pBdr>
-        <w:ind w:left="720" w:hanging="720"/>
-        <w:rPr>
-          <w:color w:val="000000"/>
-        </w:rPr>
-      </w:pPr>
-      <w:r>
-        <w:rPr>
-          <w:color w:val="000000"/>
-        </w:rPr>
-        <w:t xml:space="preserve">Cobb, C. W. &amp; Douglas, P. H. 1928. A theory of production. </w:t>
-      </w:r>
-      <w:r>
-        <w:rPr>
-          <w:i/>
-          <w:color w:val="000000"/>
-        </w:rPr>
-        <w:t>The American Economic Review,</w:t>
-      </w:r>
-      <w:r>
-        <w:rPr>
-          <w:color w:val="000000"/>
-        </w:rPr>
-        <w:t xml:space="preserve"> 18</w:t>
-      </w:r>
-      <w:r>
-        <w:rPr>
-          <w:b/>
-          <w:color w:val="000000"/>
-        </w:rPr>
-        <w:t>,</w:t>
-      </w:r>
-      <w:r>
-        <w:rPr>
-          <w:color w:val="000000"/>
-        </w:rPr>
-        <w:t xml:space="preserve"> 139-165.</w:t>
-      </w:r>
-    </w:p>
-    <w:p>
-      <w:pPr>
-        <w:pBdr>
-          <w:top w:val="nil"/>
-          <w:left w:val="nil"/>
-          <w:bottom w:val="nil"/>
-          <w:right w:val="nil"/>
-          <w:between w:val="nil"/>
-        </w:pBdr>
-        <w:ind w:left="720" w:hanging="720"/>
-        <w:rPr>
-          <w:color w:val="000000"/>
-        </w:rPr>
-      </w:pPr>
-      <w:r>
-        <w:rPr>
-          <w:color w:val="000000"/>
-        </w:rPr>
-        <w:t>Christensen, V. 1992. Network analysis of trophic interactions in aquatic ecosystems.  Copenhagen, Denmark. Copenhagen, Denmark.</w:t>
-      </w:r>
-    </w:p>
-    <w:p>
-      <w:pPr>
-        <w:pBdr>
-          <w:top w:val="nil"/>
-          <w:left w:val="nil"/>
-          <w:bottom w:val="nil"/>
-          <w:right w:val="nil"/>
-          <w:between w:val="nil"/>
-        </w:pBdr>
-        <w:ind w:left="720" w:hanging="720"/>
-        <w:rPr>
-          <w:color w:val="000000"/>
-        </w:rPr>
-      </w:pPr>
-      <w:r>
-        <w:rPr>
-          <w:color w:val="000000"/>
-        </w:rPr>
-        <w:t xml:space="preserve">SEAFDEC 2005. </w:t>
-      </w:r>
-      <w:r>
-        <w:rPr>
-          <w:i/>
-          <w:color w:val="000000"/>
-        </w:rPr>
-        <w:t>Handbook on Collecting Fishery Statistics for Inland and Coastal Fisheries</w:t>
-      </w:r>
-      <w:r>
-        <w:rPr>
-          <w:color w:val="000000"/>
-        </w:rPr>
-        <w:t>, Southeast Asian Fisheries Development Center.</w:t>
-      </w:r>
-    </w:p>
-    <w:p>
-      <w:pPr>
-        <w:pBdr>
-          <w:top w:val="nil"/>
-          <w:left w:val="nil"/>
-          <w:bottom w:val="nil"/>
-          <w:right w:val="nil"/>
-          <w:between w:val="nil"/>
-        </w:pBdr>
-        <w:ind w:left="709" w:hanging="709"/>
-        <w:rPr>
-          <w:color w:val="000000"/>
-        </w:rPr>
-      </w:pPr>
-      <w:r>
-        <w:rPr>
-          <w:color w:val="000000"/>
-        </w:rPr>
-        <w:t xml:space="preserve">Gao, J., </w:t>
-      </w:r>
-      <w:proofErr w:type="spellStart"/>
-      <w:r>
-        <w:rPr>
-          <w:color w:val="000000"/>
-        </w:rPr>
-        <w:t>Barzel</w:t>
-      </w:r>
-      <w:proofErr w:type="spellEnd"/>
-      <w:r>
-        <w:rPr>
-          <w:color w:val="000000"/>
-        </w:rPr>
-        <w:t xml:space="preserve">, B. &amp; </w:t>
-      </w:r>
-      <w:proofErr w:type="spellStart"/>
-      <w:r>
-        <w:rPr>
-          <w:color w:val="000000"/>
-        </w:rPr>
-        <w:t>Barabsi</w:t>
-      </w:r>
-      <w:proofErr w:type="spellEnd"/>
-      <w:r>
-        <w:rPr>
-          <w:color w:val="000000"/>
-        </w:rPr>
-        <w:t xml:space="preserve">, A.-L. 2016. Universal resilience patterns in complex networks. </w:t>
-      </w:r>
-      <w:r>
-        <w:rPr>
-          <w:i/>
-          <w:color w:val="000000"/>
-        </w:rPr>
-        <w:t>Nature,</w:t>
-      </w:r>
-      <w:r>
-        <w:rPr>
-          <w:color w:val="000000"/>
-        </w:rPr>
-        <w:t xml:space="preserve"> 530</w:t>
-      </w:r>
-      <w:r>
-        <w:rPr>
-          <w:b/>
-          <w:color w:val="000000"/>
-        </w:rPr>
-        <w:t>,</w:t>
-      </w:r>
-      <w:r>
-        <w:rPr>
-          <w:color w:val="000000"/>
-        </w:rPr>
-        <w:t xml:space="preserve"> 307-312.</w:t>
-      </w:r>
-    </w:p>
-    <w:p>
-      <w:pPr>
-        <w:pBdr>
-          <w:top w:val="nil"/>
-          <w:left w:val="nil"/>
-          <w:bottom w:val="nil"/>
-          <w:right w:val="nil"/>
-          <w:between w:val="nil"/>
-        </w:pBdr>
-        <w:ind w:left="720" w:hanging="720"/>
-        <w:rPr>
-          <w:color w:val="000000"/>
-        </w:rPr>
-      </w:pPr>
-      <w:r>
-        <w:rPr>
-          <w:color w:val="000000"/>
-        </w:rPr>
-        <w:t xml:space="preserve">Garcia, S. M., Kolding, J., Rice, J., Rochet, M. J., Zhou, S., Arimoto, T., Beyer, J. E., Borges, L., Bundy, A., Dunn, D., Fulton, E., Hall, M., Heino, M., Law, R., Makino, M., </w:t>
-      </w:r>
-      <w:proofErr w:type="spellStart"/>
-      <w:r>
-        <w:rPr>
-          <w:color w:val="000000"/>
-        </w:rPr>
-        <w:t>Rijnsdorp</w:t>
-      </w:r>
-      <w:proofErr w:type="spellEnd"/>
-      <w:r>
-        <w:rPr>
-          <w:color w:val="000000"/>
-        </w:rPr>
-        <w:t xml:space="preserve">, A. D., Simard, F. &amp; Smith, A. D. M. 2012. Reconsidering the consequences of selective fisheries. </w:t>
-      </w:r>
-      <w:r>
-        <w:rPr>
-          <w:i/>
-          <w:color w:val="000000"/>
-        </w:rPr>
-        <w:t>Science,</w:t>
-      </w:r>
-      <w:r>
-        <w:rPr>
-          <w:color w:val="000000"/>
-        </w:rPr>
-        <w:t xml:space="preserve"> 335</w:t>
-      </w:r>
-      <w:r>
-        <w:rPr>
-          <w:b/>
-          <w:color w:val="000000"/>
-        </w:rPr>
-        <w:t>,</w:t>
-      </w:r>
-      <w:r>
-        <w:rPr>
-          <w:color w:val="000000"/>
-        </w:rPr>
-        <w:t xml:space="preserve"> 1045-1047.</w:t>
-      </w:r>
-    </w:p>
-    <w:p>
-      <w:pPr>
-        <w:pBdr>
-          <w:top w:val="nil"/>
-          <w:left w:val="nil"/>
-          <w:bottom w:val="nil"/>
-          <w:right w:val="nil"/>
-          <w:between w:val="nil"/>
-        </w:pBdr>
-        <w:ind w:left="720" w:hanging="720"/>
-        <w:rPr>
-          <w:color w:val="000000"/>
-        </w:rPr>
-      </w:pPr>
-      <w:r>
-        <w:rPr>
-          <w:color w:val="000000"/>
-        </w:rPr>
-        <w:t xml:space="preserve">Hilborn, R. &amp; Walters, C. J. 1992. </w:t>
-      </w:r>
-      <w:r>
-        <w:rPr>
-          <w:i/>
-          <w:color w:val="000000"/>
-        </w:rPr>
-        <w:t xml:space="preserve">Quantitative Fisheries Stock Assessment: Choice, Dynamics and Uncertainty, </w:t>
-      </w:r>
-      <w:r>
-        <w:rPr>
-          <w:color w:val="000000"/>
-        </w:rPr>
-        <w:t>New York/London, Chapman and Hall.</w:t>
-      </w:r>
-    </w:p>
-    <w:p>
-      <w:pPr>
-        <w:pBdr>
-          <w:top w:val="nil"/>
-          <w:left w:val="nil"/>
-          <w:bottom w:val="nil"/>
-          <w:right w:val="nil"/>
-          <w:between w:val="nil"/>
-        </w:pBdr>
-        <w:ind w:left="720" w:hanging="720"/>
-        <w:rPr>
-          <w:color w:val="000000"/>
-        </w:rPr>
-      </w:pPr>
-      <w:r>
-        <w:rPr>
-          <w:color w:val="000000"/>
-        </w:rPr>
-        <w:t xml:space="preserve">Iverson, R. L. 1990. Control of marine fish production. </w:t>
-      </w:r>
-      <w:r>
-        <w:rPr>
-          <w:i/>
-          <w:color w:val="000000"/>
-        </w:rPr>
-        <w:t>Limnology and Oceanography,</w:t>
-      </w:r>
-      <w:r>
-        <w:rPr>
-          <w:color w:val="000000"/>
-        </w:rPr>
-        <w:t xml:space="preserve"> 35</w:t>
-      </w:r>
-      <w:r>
-        <w:rPr>
-          <w:b/>
-          <w:color w:val="000000"/>
-        </w:rPr>
-        <w:t>,</w:t>
-      </w:r>
-      <w:r>
-        <w:rPr>
-          <w:color w:val="000000"/>
-        </w:rPr>
-        <w:t xml:space="preserve"> 1593-1604.</w:t>
-      </w:r>
-    </w:p>
-    <w:p>
-      <w:pPr>
-        <w:pBdr>
-          <w:top w:val="nil"/>
-          <w:left w:val="nil"/>
-          <w:bottom w:val="nil"/>
-          <w:right w:val="nil"/>
-          <w:between w:val="nil"/>
-        </w:pBdr>
-        <w:ind w:left="720" w:hanging="720"/>
-        <w:rPr>
-          <w:color w:val="000000"/>
-        </w:rPr>
-      </w:pPr>
-      <w:r>
-        <w:rPr>
-          <w:color w:val="000000"/>
-        </w:rPr>
-        <w:t xml:space="preserve">Heymans, J. J., Coll, M., Link, J. S., Mackinson, S., </w:t>
-      </w:r>
-      <w:proofErr w:type="spellStart"/>
-      <w:r>
-        <w:rPr>
-          <w:color w:val="000000"/>
-        </w:rPr>
-        <w:t>Steenbeek</w:t>
-      </w:r>
-      <w:proofErr w:type="spellEnd"/>
-      <w:r>
-        <w:rPr>
-          <w:color w:val="000000"/>
-        </w:rPr>
-        <w:t xml:space="preserve">, J., Walters, C. &amp; Christensen, V. 2016. Best practice in </w:t>
-      </w:r>
-      <w:proofErr w:type="spellStart"/>
-      <w:r>
-        <w:rPr>
-          <w:color w:val="000000"/>
-        </w:rPr>
-        <w:t>Ecopath</w:t>
-      </w:r>
-      <w:proofErr w:type="spellEnd"/>
-      <w:r>
-        <w:rPr>
-          <w:color w:val="000000"/>
-        </w:rPr>
-        <w:t xml:space="preserve"> with </w:t>
-      </w:r>
-      <w:proofErr w:type="spellStart"/>
-      <w:r>
-        <w:rPr>
-          <w:color w:val="000000"/>
-        </w:rPr>
-        <w:t>Ecosim</w:t>
-      </w:r>
-      <w:proofErr w:type="spellEnd"/>
-      <w:r>
-        <w:rPr>
-          <w:color w:val="000000"/>
-        </w:rPr>
-        <w:t xml:space="preserve"> food-web models for ecosystem-based management. </w:t>
-      </w:r>
-      <w:r>
-        <w:rPr>
-          <w:i/>
-          <w:color w:val="000000"/>
-        </w:rPr>
-        <w:t>Ecological Modelling,</w:t>
-      </w:r>
-      <w:r>
-        <w:rPr>
-          <w:color w:val="000000"/>
-        </w:rPr>
-        <w:t xml:space="preserve"> 331</w:t>
-      </w:r>
-      <w:r>
-        <w:rPr>
-          <w:b/>
-          <w:color w:val="000000"/>
-        </w:rPr>
-        <w:t>,</w:t>
-      </w:r>
-      <w:r>
-        <w:rPr>
-          <w:color w:val="000000"/>
-        </w:rPr>
-        <w:t xml:space="preserve"> 173-184.</w:t>
-      </w:r>
-    </w:p>
-    <w:p>
-      <w:pPr>
-        <w:pBdr>
-          <w:top w:val="nil"/>
-          <w:left w:val="nil"/>
-          <w:bottom w:val="nil"/>
-          <w:right w:val="nil"/>
-          <w:between w:val="nil"/>
-        </w:pBdr>
-        <w:ind w:left="720" w:hanging="720"/>
-        <w:rPr>
-          <w:color w:val="000000"/>
-        </w:rPr>
-      </w:pPr>
-      <w:r>
-        <w:rPr>
-          <w:color w:val="000000"/>
-        </w:rPr>
-        <w:t xml:space="preserve">Link, J. S. 2010. Adding rigor to ecological network models by evaluating a set of pre-balance diagnostics: A plea for PREBAL. </w:t>
-      </w:r>
-      <w:r>
-        <w:rPr>
-          <w:i/>
-          <w:color w:val="000000"/>
-        </w:rPr>
-        <w:t>Ecological Modelling,</w:t>
-      </w:r>
-      <w:r>
-        <w:rPr>
-          <w:color w:val="000000"/>
-        </w:rPr>
-        <w:t xml:space="preserve"> 221</w:t>
-      </w:r>
-      <w:r>
-        <w:rPr>
-          <w:b/>
-          <w:color w:val="000000"/>
-        </w:rPr>
-        <w:t>,</w:t>
-      </w:r>
-      <w:r>
-        <w:rPr>
-          <w:color w:val="000000"/>
-        </w:rPr>
-        <w:t xml:space="preserve"> 1580-1591.</w:t>
-      </w:r>
-    </w:p>
-    <w:p>
-      <w:pPr>
-        <w:pBdr>
-          <w:top w:val="nil"/>
-          <w:left w:val="nil"/>
-          <w:bottom w:val="nil"/>
-          <w:right w:val="nil"/>
-          <w:between w:val="nil"/>
-        </w:pBdr>
-        <w:ind w:left="720" w:hanging="720"/>
-        <w:rPr>
-          <w:color w:val="000000"/>
-        </w:rPr>
-      </w:pPr>
-      <w:r>
-        <w:rPr>
-          <w:color w:val="000000"/>
-        </w:rPr>
-        <w:t xml:space="preserve">Link, J. S. 2018. System-level optimal yield: increased value, less risk, improved stability, and better fisheries. </w:t>
-      </w:r>
-      <w:r>
-        <w:rPr>
-          <w:i/>
-          <w:color w:val="000000"/>
-        </w:rPr>
-        <w:t>Canadian Journal of Fisheries and Aquatic Sciences,</w:t>
-      </w:r>
-      <w:r>
-        <w:rPr>
-          <w:color w:val="000000"/>
-        </w:rPr>
-        <w:t xml:space="preserve"> 75</w:t>
-      </w:r>
-      <w:r>
-        <w:rPr>
-          <w:b/>
-          <w:color w:val="000000"/>
-        </w:rPr>
-        <w:t>,</w:t>
-      </w:r>
-      <w:r>
-        <w:rPr>
-          <w:color w:val="000000"/>
-        </w:rPr>
-        <w:t xml:space="preserve"> 1-16.</w:t>
-      </w:r>
-    </w:p>
-    <w:p>
-      <w:pPr>
-        <w:pBdr>
-          <w:top w:val="nil"/>
-          <w:left w:val="nil"/>
-          <w:bottom w:val="nil"/>
-          <w:right w:val="nil"/>
-          <w:between w:val="nil"/>
-        </w:pBdr>
-        <w:ind w:left="720" w:hanging="720"/>
-        <w:rPr>
-          <w:color w:val="000000"/>
-        </w:rPr>
-      </w:pPr>
-      <w:r>
-        <w:rPr>
-          <w:color w:val="000000"/>
-        </w:rPr>
-        <w:t xml:space="preserve">Link, J. S. &amp; Watson, R. A. 2019. Global ecosystem overfishing: Clear delineation within real limits to production. </w:t>
-      </w:r>
-      <w:r>
-        <w:rPr>
-          <w:i/>
-          <w:color w:val="000000"/>
-        </w:rPr>
-        <w:t>Science Advances,</w:t>
-      </w:r>
-      <w:r>
-        <w:rPr>
-          <w:color w:val="000000"/>
-        </w:rPr>
-        <w:t xml:space="preserve"> 5</w:t>
-      </w:r>
-      <w:r>
-        <w:rPr>
-          <w:b/>
-          <w:color w:val="000000"/>
-        </w:rPr>
-        <w:t>,</w:t>
-      </w:r>
-      <w:r>
-        <w:rPr>
-          <w:color w:val="000000"/>
-        </w:rPr>
-        <w:t xml:space="preserve"> eaav0474.</w:t>
-      </w:r>
-    </w:p>
-    <w:p>
-      <w:pPr>
-        <w:pBdr>
-          <w:top w:val="nil"/>
-          <w:left w:val="nil"/>
-          <w:bottom w:val="nil"/>
-          <w:right w:val="nil"/>
-          <w:between w:val="nil"/>
-        </w:pBdr>
-        <w:ind w:left="720" w:hanging="720"/>
-        <w:rPr>
-          <w:color w:val="000000"/>
-        </w:rPr>
-      </w:pPr>
-      <w:r>
-        <w:rPr>
-          <w:color w:val="000000"/>
-        </w:rPr>
-        <w:t xml:space="preserve">Marquet, P. A., Quiñones, R. A., </w:t>
-      </w:r>
-      <w:proofErr w:type="spellStart"/>
-      <w:r>
-        <w:rPr>
-          <w:color w:val="000000"/>
-        </w:rPr>
-        <w:t>Abades</w:t>
-      </w:r>
-      <w:proofErr w:type="spellEnd"/>
-      <w:r>
-        <w:rPr>
-          <w:color w:val="000000"/>
-        </w:rPr>
-        <w:t xml:space="preserve">, S., Labra, F., Tognelli, M., Arim, M. &amp; Rivadeneira, M. 2005. Scaling and power-laws in ecological systems. </w:t>
-      </w:r>
-      <w:r>
-        <w:rPr>
-          <w:i/>
-          <w:color w:val="000000"/>
-        </w:rPr>
-        <w:t>Journal of Experimental Biology,</w:t>
-      </w:r>
-      <w:r>
-        <w:rPr>
-          <w:color w:val="000000"/>
-        </w:rPr>
-        <w:t xml:space="preserve"> 208</w:t>
-      </w:r>
-      <w:r>
-        <w:rPr>
-          <w:b/>
-          <w:color w:val="000000"/>
-        </w:rPr>
-        <w:t>,</w:t>
-      </w:r>
-      <w:r>
-        <w:rPr>
-          <w:color w:val="000000"/>
-        </w:rPr>
-        <w:t xml:space="preserve"> 1749-1769.</w:t>
-      </w:r>
-    </w:p>
-    <w:p>
-      <w:pPr>
-        <w:pBdr>
-          <w:top w:val="nil"/>
-          <w:left w:val="nil"/>
-          <w:bottom w:val="nil"/>
-          <w:right w:val="nil"/>
-          <w:between w:val="nil"/>
-        </w:pBdr>
-        <w:ind w:left="720" w:hanging="720"/>
-        <w:rPr>
-          <w:color w:val="000000"/>
-        </w:rPr>
-      </w:pPr>
-      <w:r>
-        <w:rPr>
-          <w:color w:val="000000"/>
-        </w:rPr>
-        <w:t xml:space="preserve">Moiseev, P. A. 1994. </w:t>
-      </w:r>
-      <w:r>
-        <w:rPr>
-          <w:i/>
-          <w:color w:val="000000"/>
-        </w:rPr>
-        <w:t xml:space="preserve">Present fish productivity and bioproduction potential of the world aquatic habitats, </w:t>
-      </w:r>
-      <w:r>
-        <w:rPr>
-          <w:color w:val="000000"/>
-        </w:rPr>
-        <w:t>Rome, Food and Agriculture Organization of the United Nations.</w:t>
-      </w:r>
-    </w:p>
-    <w:p>
-      <w:pPr>
-        <w:pBdr>
-          <w:top w:val="nil"/>
-          <w:left w:val="nil"/>
-          <w:bottom w:val="nil"/>
-          <w:right w:val="nil"/>
-          <w:between w:val="nil"/>
-        </w:pBdr>
-        <w:ind w:left="720" w:hanging="720"/>
-        <w:rPr>
-          <w:color w:val="000000"/>
-        </w:rPr>
-      </w:pPr>
-      <w:r>
-        <w:rPr>
-          <w:color w:val="000000"/>
-        </w:rPr>
-        <w:lastRenderedPageBreak/>
-        <w:t xml:space="preserve">Olsen, E., Fay, G., </w:t>
-      </w:r>
-      <w:proofErr w:type="spellStart"/>
-      <w:r>
-        <w:rPr>
-          <w:color w:val="000000"/>
-        </w:rPr>
-        <w:t>Gaichas</w:t>
-      </w:r>
-      <w:proofErr w:type="spellEnd"/>
-      <w:r>
-        <w:rPr>
-          <w:color w:val="000000"/>
-        </w:rPr>
-        <w:t xml:space="preserve">, S., Gamble, R., Lucey, S. &amp; Link, J. S. 2016. Ecosystem model skill assessment. </w:t>
-      </w:r>
-      <w:proofErr w:type="gramStart"/>
-      <w:r>
-        <w:rPr>
-          <w:color w:val="000000"/>
-        </w:rPr>
-        <w:t>Yes</w:t>
-      </w:r>
-      <w:proofErr w:type="gramEnd"/>
-      <w:r>
-        <w:rPr>
-          <w:color w:val="000000"/>
-        </w:rPr>
-        <w:t xml:space="preserve"> We Can! </w:t>
-      </w:r>
-      <w:proofErr w:type="spellStart"/>
-      <w:r>
-        <w:rPr>
-          <w:color w:val="000000"/>
-        </w:rPr>
-        <w:t>PLoS</w:t>
-      </w:r>
-      <w:proofErr w:type="spellEnd"/>
-      <w:r>
-        <w:rPr>
-          <w:color w:val="000000"/>
-        </w:rPr>
-        <w:t xml:space="preserve"> ONE, 11, 1-24.</w:t>
-      </w:r>
-    </w:p>
-    <w:p>
-      <w:pPr>
-        <w:pBdr>
-          <w:top w:val="nil"/>
-          <w:left w:val="nil"/>
-          <w:bottom w:val="nil"/>
-          <w:right w:val="nil"/>
-          <w:between w:val="nil"/>
-        </w:pBdr>
-        <w:ind w:left="720" w:hanging="720"/>
-        <w:rPr>
-          <w:color w:val="000000"/>
-        </w:rPr>
-      </w:pPr>
-      <w:r>
-        <w:rPr>
-          <w:color w:val="000000"/>
-        </w:rPr>
-        <w:t xml:space="preserve">Polacheck, T., Hilborn, R. &amp; Punt, A. E. 1993. Fitting surplus production models: comparing methods and measuring uncertainty. </w:t>
-      </w:r>
-      <w:r>
-        <w:rPr>
-          <w:i/>
-          <w:color w:val="000000"/>
-        </w:rPr>
-        <w:t>Canadian Journal of Fisheries and Aquatic Sciences,</w:t>
-      </w:r>
-      <w:r>
-        <w:rPr>
-          <w:color w:val="000000"/>
-        </w:rPr>
-        <w:t xml:space="preserve"> 50</w:t>
-      </w:r>
-      <w:r>
-        <w:rPr>
-          <w:b/>
-          <w:color w:val="000000"/>
-        </w:rPr>
-        <w:t>,</w:t>
-      </w:r>
-      <w:r>
-        <w:rPr>
-          <w:color w:val="000000"/>
-        </w:rPr>
-        <w:t xml:space="preserve"> 2597-2607.</w:t>
-      </w:r>
-    </w:p>
-    <w:p>
-      <w:pPr>
-        <w:pBdr>
-          <w:top w:val="nil"/>
-          <w:left w:val="nil"/>
-          <w:bottom w:val="nil"/>
-          <w:right w:val="nil"/>
-          <w:between w:val="nil"/>
-        </w:pBdr>
-        <w:ind w:left="720" w:hanging="720"/>
-        <w:rPr>
-          <w:i/>
-          <w:color w:val="000000"/>
-        </w:rPr>
-      </w:pPr>
-      <w:proofErr w:type="spellStart"/>
-      <w:r>
-        <w:rPr>
-          <w:color w:val="000000"/>
-        </w:rPr>
-        <w:t>Phoonsawat</w:t>
-      </w:r>
-      <w:proofErr w:type="spellEnd"/>
-      <w:r>
-        <w:rPr>
-          <w:color w:val="000000"/>
-        </w:rPr>
-        <w:t xml:space="preserve">, R., </w:t>
-      </w:r>
-      <w:proofErr w:type="spellStart"/>
-      <w:r>
-        <w:rPr>
-          <w:color w:val="000000"/>
-        </w:rPr>
-        <w:t>Supongpan</w:t>
-      </w:r>
-      <w:proofErr w:type="spellEnd"/>
-      <w:r>
-        <w:rPr>
-          <w:color w:val="000000"/>
-        </w:rPr>
-        <w:t xml:space="preserve">, M. &amp; Christensen, V. 2009. Introducing ecosystem-based management in the Gulf of Thailand. </w:t>
-      </w:r>
-      <w:r>
-        <w:rPr>
-          <w:i/>
-          <w:color w:val="000000"/>
-        </w:rPr>
-        <w:t>IRD Project no. 003711</w:t>
-      </w:r>
-    </w:p>
-    <w:p>
-      <w:pPr>
-        <w:pBdr>
-          <w:top w:val="nil"/>
-          <w:left w:val="nil"/>
-          <w:bottom w:val="nil"/>
-          <w:right w:val="nil"/>
-          <w:between w:val="nil"/>
-        </w:pBdr>
-        <w:ind w:left="720" w:hanging="720"/>
-        <w:rPr>
-          <w:color w:val="000000"/>
-        </w:rPr>
-      </w:pPr>
-      <w:r>
-        <w:rPr>
-          <w:color w:val="000000"/>
-        </w:rPr>
-        <w:t xml:space="preserve">Punt, A. E. 1990. Is B1 = K an appropriate assumption when applying an observation error production-model estimator to catch-effort data. </w:t>
-      </w:r>
-      <w:r>
-        <w:rPr>
-          <w:i/>
-          <w:color w:val="000000"/>
-        </w:rPr>
-        <w:t>South African Journal of Marine Science,</w:t>
-      </w:r>
-      <w:r>
-        <w:rPr>
-          <w:color w:val="000000"/>
-        </w:rPr>
-        <w:t xml:space="preserve"> 9</w:t>
-      </w:r>
-      <w:r>
-        <w:rPr>
-          <w:b/>
-          <w:color w:val="000000"/>
-        </w:rPr>
-        <w:t>,</w:t>
-      </w:r>
-      <w:r>
-        <w:rPr>
-          <w:color w:val="000000"/>
-        </w:rPr>
-        <w:t xml:space="preserve"> 249-259.</w:t>
-      </w:r>
-    </w:p>
-    <w:p>
-      <w:pPr>
-        <w:pBdr>
-          <w:top w:val="nil"/>
-          <w:left w:val="nil"/>
-          <w:bottom w:val="nil"/>
-          <w:right w:val="nil"/>
-          <w:between w:val="nil"/>
-        </w:pBdr>
-        <w:ind w:left="720" w:hanging="720"/>
-        <w:rPr>
-          <w:color w:val="000000"/>
-        </w:rPr>
-      </w:pPr>
-      <w:r>
-        <w:rPr>
-          <w:color w:val="000000"/>
-        </w:rPr>
-        <w:t xml:space="preserve">Punt, A. E. &amp; </w:t>
-      </w:r>
-      <w:proofErr w:type="spellStart"/>
-      <w:r>
-        <w:rPr>
-          <w:color w:val="000000"/>
-        </w:rPr>
-        <w:t>Szuwalski</w:t>
-      </w:r>
-      <w:proofErr w:type="spellEnd"/>
-      <w:r>
-        <w:rPr>
-          <w:color w:val="000000"/>
-        </w:rPr>
-        <w:t xml:space="preserve">, C. 2012. How well can FMSY and BMSY be estimated using empirical measures of surplus production? </w:t>
-      </w:r>
-      <w:r>
-        <w:rPr>
-          <w:i/>
-          <w:color w:val="000000"/>
-        </w:rPr>
-        <w:t>Fisheries Research,</w:t>
-      </w:r>
-      <w:r>
-        <w:rPr>
-          <w:color w:val="000000"/>
-        </w:rPr>
-        <w:t xml:space="preserve"> 134-136</w:t>
-      </w:r>
-      <w:r>
-        <w:rPr>
-          <w:b/>
-          <w:color w:val="000000"/>
-        </w:rPr>
-        <w:t>,</w:t>
-      </w:r>
-      <w:r>
-        <w:rPr>
-          <w:color w:val="000000"/>
-        </w:rPr>
-        <w:t xml:space="preserve"> 113-124.</w:t>
-      </w:r>
-    </w:p>
-    <w:p>
-      <w:pPr>
-        <w:pBdr>
-          <w:top w:val="nil"/>
-          <w:left w:val="nil"/>
-          <w:bottom w:val="nil"/>
-          <w:right w:val="nil"/>
-          <w:between w:val="nil"/>
-        </w:pBdr>
-        <w:ind w:left="720" w:hanging="720"/>
-        <w:rPr>
-          <w:color w:val="000000"/>
-        </w:rPr>
-      </w:pPr>
-      <w:r>
-        <w:rPr>
-          <w:color w:val="000000"/>
-        </w:rPr>
-        <w:t xml:space="preserve">Rice, J. C. 2005. Implementation of the Ecosystem Approach to Fisheries Management - asynchronous co-evolution at the interface between science and policy. </w:t>
-      </w:r>
-      <w:r>
-        <w:rPr>
-          <w:i/>
-          <w:color w:val="000000"/>
-        </w:rPr>
-        <w:t>Marine Ecology Progress Series,</w:t>
-      </w:r>
-      <w:r>
-        <w:rPr>
-          <w:color w:val="000000"/>
-        </w:rPr>
-        <w:t xml:space="preserve"> 300</w:t>
-      </w:r>
-      <w:r>
-        <w:rPr>
-          <w:b/>
-          <w:color w:val="000000"/>
-        </w:rPr>
-        <w:t>,</w:t>
-      </w:r>
-      <w:r>
-        <w:rPr>
-          <w:color w:val="000000"/>
-        </w:rPr>
-        <w:t xml:space="preserve"> 265-270.</w:t>
-      </w:r>
-    </w:p>
-    <w:p>
-      <w:pPr>
-        <w:pBdr>
-          <w:top w:val="nil"/>
-          <w:left w:val="nil"/>
-          <w:bottom w:val="nil"/>
-          <w:right w:val="nil"/>
-          <w:between w:val="nil"/>
-        </w:pBdr>
-        <w:ind w:left="720" w:hanging="720"/>
-        <w:rPr>
-          <w:color w:val="000000"/>
-        </w:rPr>
-      </w:pPr>
-      <w:r>
-        <w:rPr>
-          <w:color w:val="000000"/>
-        </w:rPr>
-        <w:t xml:space="preserve">Rousseau, Y., Watson, R. A., Blanchard, J. L. &amp; Fulton, E. A. 2019. Evolution of global marine fishing fleets and the response of fished resources. </w:t>
-      </w:r>
-      <w:r>
-        <w:rPr>
-          <w:i/>
-          <w:color w:val="000000"/>
-        </w:rPr>
-        <w:t>Proceedings of the National Academy of Sciences,</w:t>
-      </w:r>
-      <w:r>
-        <w:rPr>
-          <w:color w:val="000000"/>
-        </w:rPr>
-        <w:t xml:space="preserve"> 116</w:t>
-      </w:r>
-      <w:r>
-        <w:rPr>
-          <w:b/>
-          <w:color w:val="000000"/>
-        </w:rPr>
-        <w:t>,</w:t>
-      </w:r>
-      <w:r>
-        <w:rPr>
-          <w:color w:val="000000"/>
-        </w:rPr>
-        <w:t xml:space="preserve"> 12238-12243.</w:t>
-      </w:r>
-    </w:p>
-    <w:p>
-      <w:pPr>
-        <w:pBdr>
-          <w:top w:val="nil"/>
-          <w:left w:val="nil"/>
-          <w:bottom w:val="nil"/>
-          <w:right w:val="nil"/>
-          <w:between w:val="nil"/>
-        </w:pBdr>
-        <w:ind w:left="720" w:hanging="720"/>
-        <w:rPr>
-          <w:color w:val="000000"/>
-        </w:rPr>
-      </w:pPr>
-      <w:r>
-        <w:rPr>
-          <w:color w:val="000000"/>
-        </w:rPr>
-        <w:t xml:space="preserve">Ryther, J. H. 1969. Photosynthesis and Fish Production in the Sea. </w:t>
-      </w:r>
-      <w:r>
-        <w:rPr>
-          <w:i/>
-          <w:color w:val="000000"/>
-        </w:rPr>
-        <w:t>Science,</w:t>
-      </w:r>
-      <w:r>
-        <w:rPr>
-          <w:color w:val="000000"/>
-        </w:rPr>
-        <w:t xml:space="preserve"> 166</w:t>
-      </w:r>
-      <w:r>
-        <w:rPr>
-          <w:b/>
-          <w:color w:val="000000"/>
-        </w:rPr>
-        <w:t>,</w:t>
-      </w:r>
-      <w:r>
-        <w:rPr>
-          <w:color w:val="000000"/>
-        </w:rPr>
-        <w:t xml:space="preserve"> 72-76.</w:t>
-      </w:r>
-    </w:p>
-    <w:p>
-      <w:pPr>
-        <w:pBdr>
-          <w:top w:val="nil"/>
-          <w:left w:val="nil"/>
-          <w:bottom w:val="nil"/>
-          <w:right w:val="nil"/>
-          <w:between w:val="nil"/>
-        </w:pBdr>
-        <w:ind w:left="720" w:hanging="720"/>
-        <w:rPr>
-          <w:color w:val="000000"/>
-        </w:rPr>
-      </w:pPr>
-      <w:r>
-        <w:rPr>
-          <w:color w:val="000000"/>
-        </w:rPr>
-        <w:t xml:space="preserve">Shannon, L., Coll, M., Bundy, A., </w:t>
-      </w:r>
-      <w:proofErr w:type="spellStart"/>
-      <w:r>
-        <w:rPr>
-          <w:color w:val="000000"/>
-        </w:rPr>
-        <w:t>Gascuel</w:t>
-      </w:r>
-      <w:proofErr w:type="spellEnd"/>
-      <w:r>
-        <w:rPr>
-          <w:color w:val="000000"/>
-        </w:rPr>
-        <w:t xml:space="preserve">, D., Heymans, J. J., Kleisner, K., Lynam, C. P., </w:t>
-      </w:r>
-      <w:proofErr w:type="spellStart"/>
-      <w:r>
-        <w:rPr>
-          <w:color w:val="000000"/>
-        </w:rPr>
-        <w:t>Piroddi</w:t>
-      </w:r>
-      <w:proofErr w:type="spellEnd"/>
-      <w:r>
-        <w:rPr>
-          <w:color w:val="000000"/>
-        </w:rPr>
-        <w:t>, C., Tam, J., Travers-</w:t>
-      </w:r>
-      <w:proofErr w:type="spellStart"/>
-      <w:r>
-        <w:rPr>
-          <w:color w:val="000000"/>
-        </w:rPr>
-        <w:t>Trolet</w:t>
-      </w:r>
-      <w:proofErr w:type="spellEnd"/>
-      <w:r>
-        <w:rPr>
-          <w:color w:val="000000"/>
-        </w:rPr>
-        <w:t xml:space="preserve">, M. &amp; Shin, Y. 2014. Trophic level-based indicators to track fishing impacts across marine ecosystems. </w:t>
-      </w:r>
-      <w:r>
-        <w:rPr>
-          <w:i/>
-          <w:color w:val="000000"/>
-        </w:rPr>
-        <w:t>Marine Ecology Progress Series,</w:t>
-      </w:r>
-      <w:r>
-        <w:rPr>
-          <w:color w:val="000000"/>
-        </w:rPr>
-        <w:t xml:space="preserve"> 512</w:t>
-      </w:r>
-      <w:r>
-        <w:rPr>
-          <w:b/>
-          <w:color w:val="000000"/>
-        </w:rPr>
-        <w:t>,</w:t>
-      </w:r>
-      <w:r>
-        <w:rPr>
-          <w:color w:val="000000"/>
-        </w:rPr>
-        <w:t xml:space="preserve"> 115-140.</w:t>
-      </w:r>
-    </w:p>
-    <w:p>
-      <w:pPr>
-        <w:pBdr>
-          <w:top w:val="nil"/>
-          <w:left w:val="nil"/>
-          <w:bottom w:val="nil"/>
-          <w:right w:val="nil"/>
-          <w:between w:val="nil"/>
-        </w:pBdr>
-        <w:ind w:left="720" w:hanging="720"/>
-        <w:rPr>
-          <w:color w:val="000000"/>
-        </w:rPr>
-      </w:pPr>
-      <w:r>
-        <w:rPr>
-          <w:color w:val="000000"/>
-        </w:rPr>
-        <w:t>Stow</w:t>
-      </w:r>
-      <w:r>
-        <w:rPr>
-          <w:color w:val="000000"/>
-        </w:rPr>
-        <w:t xml:space="preserve">, </w:t>
-      </w:r>
-      <w:r>
-        <w:rPr>
-          <w:color w:val="000000"/>
-        </w:rPr>
-        <w:t>C</w:t>
-      </w:r>
-      <w:r>
-        <w:rPr>
-          <w:color w:val="000000"/>
-        </w:rPr>
-        <w:t>.</w:t>
-      </w:r>
-      <w:r>
-        <w:rPr>
-          <w:color w:val="000000"/>
-        </w:rPr>
-        <w:t>A</w:t>
-      </w:r>
-      <w:r>
-        <w:rPr>
-          <w:color w:val="000000"/>
-        </w:rPr>
-        <w:t>.</w:t>
-      </w:r>
-      <w:r>
-        <w:rPr>
-          <w:color w:val="000000"/>
-        </w:rPr>
-        <w:t>, Jolliff</w:t>
-      </w:r>
-      <w:r>
-        <w:rPr>
-          <w:color w:val="000000"/>
-        </w:rPr>
-        <w:t>,</w:t>
-      </w:r>
-      <w:r>
-        <w:rPr>
-          <w:color w:val="000000"/>
-        </w:rPr>
-        <w:t xml:space="preserve"> J</w:t>
-      </w:r>
-      <w:r>
-        <w:rPr>
-          <w:color w:val="000000"/>
-        </w:rPr>
-        <w:t>.</w:t>
-      </w:r>
-      <w:r>
-        <w:rPr>
-          <w:color w:val="000000"/>
-        </w:rPr>
-        <w:t>, McGillicuddy</w:t>
-      </w:r>
-      <w:r>
-        <w:rPr>
-          <w:color w:val="000000"/>
-        </w:rPr>
-        <w:t>,</w:t>
-      </w:r>
-      <w:r>
-        <w:rPr>
-          <w:color w:val="000000"/>
-        </w:rPr>
-        <w:t xml:space="preserve"> D</w:t>
-      </w:r>
-      <w:r>
-        <w:rPr>
-          <w:color w:val="000000"/>
-        </w:rPr>
-        <w:t>.</w:t>
-      </w:r>
-      <w:r>
-        <w:rPr>
-          <w:color w:val="000000"/>
-        </w:rPr>
-        <w:t>J</w:t>
-      </w:r>
-      <w:r>
-        <w:rPr>
-          <w:color w:val="000000"/>
-        </w:rPr>
-        <w:t>.</w:t>
-      </w:r>
-      <w:r>
-        <w:rPr>
-          <w:color w:val="000000"/>
-        </w:rPr>
-        <w:t xml:space="preserve"> Jr., Doney</w:t>
-      </w:r>
-      <w:r>
-        <w:rPr>
-          <w:color w:val="000000"/>
-        </w:rPr>
-        <w:t>,</w:t>
-      </w:r>
-      <w:r>
-        <w:rPr>
-          <w:color w:val="000000"/>
-        </w:rPr>
-        <w:t xml:space="preserve"> S</w:t>
-      </w:r>
-      <w:r>
-        <w:rPr>
-          <w:color w:val="000000"/>
-        </w:rPr>
-        <w:t>.</w:t>
-      </w:r>
-      <w:r>
-        <w:rPr>
-          <w:color w:val="000000"/>
-        </w:rPr>
-        <w:t>C</w:t>
-      </w:r>
-      <w:r>
-        <w:rPr>
-          <w:color w:val="000000"/>
-        </w:rPr>
-        <w:t>.</w:t>
-      </w:r>
-      <w:r>
-        <w:rPr>
-          <w:color w:val="000000"/>
-        </w:rPr>
-        <w:t>, Allen</w:t>
-      </w:r>
-      <w:r>
-        <w:rPr>
-          <w:color w:val="000000"/>
-        </w:rPr>
-        <w:t>,</w:t>
-      </w:r>
-      <w:r>
-        <w:rPr>
-          <w:color w:val="000000"/>
-        </w:rPr>
-        <w:t xml:space="preserve"> J</w:t>
-      </w:r>
-      <w:r>
-        <w:rPr>
-          <w:color w:val="000000"/>
-        </w:rPr>
-        <w:t>.</w:t>
-      </w:r>
-      <w:r>
-        <w:rPr>
-          <w:color w:val="000000"/>
-        </w:rPr>
-        <w:t>I</w:t>
-      </w:r>
-      <w:r>
-        <w:rPr>
-          <w:color w:val="000000"/>
-        </w:rPr>
-        <w:t>.</w:t>
-      </w:r>
-      <w:r>
-        <w:rPr>
-          <w:color w:val="000000"/>
-        </w:rPr>
-        <w:t>, Friedrichs</w:t>
-      </w:r>
-      <w:r>
-        <w:rPr>
-          <w:color w:val="000000"/>
-        </w:rPr>
-        <w:t>,</w:t>
-      </w:r>
-      <w:r>
-        <w:rPr>
-          <w:color w:val="000000"/>
-        </w:rPr>
-        <w:t xml:space="preserve"> M</w:t>
-      </w:r>
-      <w:r>
-        <w:rPr>
-          <w:color w:val="000000"/>
-        </w:rPr>
-        <w:t>.</w:t>
-      </w:r>
-      <w:r>
-        <w:rPr>
-          <w:color w:val="000000"/>
-        </w:rPr>
-        <w:t>A</w:t>
-      </w:r>
-      <w:r>
-        <w:rPr>
-          <w:color w:val="000000"/>
-        </w:rPr>
-        <w:t>.</w:t>
-      </w:r>
-      <w:r>
-        <w:rPr>
-          <w:color w:val="000000"/>
-        </w:rPr>
-        <w:t>M</w:t>
-      </w:r>
-      <w:r>
-        <w:rPr>
-          <w:color w:val="000000"/>
-        </w:rPr>
-        <w:t>.</w:t>
-      </w:r>
-      <w:r>
-        <w:rPr>
-          <w:color w:val="000000"/>
-        </w:rPr>
-        <w:t xml:space="preserve">, </w:t>
-      </w:r>
-      <w:r>
-        <w:rPr>
-          <w:color w:val="000000"/>
-        </w:rPr>
-        <w:t>Rose</w:t>
-      </w:r>
-      <w:r>
-        <w:rPr>
-          <w:color w:val="000000"/>
-        </w:rPr>
-        <w:t xml:space="preserve">, K.A. &amp; </w:t>
-      </w:r>
-      <w:proofErr w:type="spellStart"/>
-      <w:r>
-        <w:rPr>
-          <w:color w:val="000000"/>
-        </w:rPr>
-        <w:t>Wallhead</w:t>
-      </w:r>
-      <w:proofErr w:type="spellEnd"/>
-      <w:r>
-        <w:rPr>
-          <w:color w:val="000000"/>
-        </w:rPr>
-        <w:t xml:space="preserve">, P. 2009. </w:t>
-      </w:r>
-      <w:r>
-        <w:rPr>
-          <w:color w:val="000000"/>
-        </w:rPr>
-        <w:t>Skill assessment for</w:t>
-      </w:r>
-      <w:r>
-        <w:rPr>
-          <w:color w:val="000000"/>
-        </w:rPr>
-        <w:t xml:space="preserve"> </w:t>
-      </w:r>
-      <w:r>
-        <w:rPr>
-          <w:color w:val="000000"/>
-        </w:rPr>
-        <w:t>coupled biological/physical models of marine systems.</w:t>
-      </w:r>
-      <w:r>
-        <w:rPr>
-          <w:i/>
-          <w:iCs/>
-          <w:color w:val="000000"/>
-        </w:rPr>
-        <w:t xml:space="preserve"> Journal of Marine Systems</w:t>
-      </w:r>
-      <w:r>
-        <w:rPr>
-          <w:color w:val="000000"/>
-        </w:rPr>
-        <w:t>,</w:t>
-      </w:r>
-      <w:r>
-        <w:rPr>
-          <w:color w:val="000000"/>
-        </w:rPr>
-        <w:t xml:space="preserve"> 76: 4–15.</w:t>
-      </w:r>
-    </w:p>
-    <w:p>
-      <w:pPr>
-        <w:pBdr>
-          <w:top w:val="nil"/>
-          <w:left w:val="nil"/>
-          <w:bottom w:val="nil"/>
-          <w:right w:val="nil"/>
-          <w:between w:val="nil"/>
-        </w:pBdr>
-        <w:ind w:left="720" w:hanging="720"/>
-        <w:rPr>
-          <w:color w:val="000000"/>
-        </w:rPr>
-      </w:pPr>
-      <w:r>
-        <w:rPr>
-          <w:color w:val="000000"/>
-        </w:rPr>
-        <w:t xml:space="preserve">Worm, B., Hilborn, R., Baum, J., Branch, T., Collie, J., Costello, C., Fogarty, M., Fulton, E., Hutchings, J., Jennings, S., Jensen, O., Lotze, H., Mace, P., McClanahan, T., Minto, C., </w:t>
-      </w:r>
-      <w:proofErr w:type="spellStart"/>
-      <w:r>
-        <w:rPr>
-          <w:color w:val="000000"/>
-        </w:rPr>
-        <w:t>Palumbi</w:t>
-      </w:r>
-      <w:proofErr w:type="spellEnd"/>
-      <w:r>
-        <w:rPr>
-          <w:color w:val="000000"/>
-        </w:rPr>
-        <w:t xml:space="preserve">, S., Parma, A., Ricard, D., Rosenberg, A., Watson, R. &amp; Zeller, D. 2009. Rebuilding global fisheries. </w:t>
-      </w:r>
-      <w:r>
-        <w:rPr>
-          <w:i/>
-          <w:color w:val="000000"/>
-        </w:rPr>
-        <w:t>Science,</w:t>
-      </w:r>
-      <w:r>
-        <w:rPr>
-          <w:color w:val="000000"/>
-        </w:rPr>
-        <w:t xml:space="preserve"> 325</w:t>
-      </w:r>
-      <w:r>
-        <w:rPr>
-          <w:b/>
-          <w:color w:val="000000"/>
-        </w:rPr>
-        <w:t>,</w:t>
-      </w:r>
-      <w:r>
-        <w:rPr>
-          <w:color w:val="000000"/>
-        </w:rPr>
-        <w:t xml:space="preserve"> 578-585.</w:t>
-      </w:r>
-    </w:p>
-    <w:p/>
+    </w:p>
     <w:sectPr>
       <w:footerReference w:type="default" r:id="rId19"/>
-      <w:pgSz w:w="11906" w:h="16838"/>
+      <w:pgSz w:w="16838" w:h="11906" w:orient="landscape"/>
       <w:pgMar w:top="1440" w:right="1440" w:bottom="1440" w:left="1440" w:header="708" w:footer="708" w:gutter="0"/>
       <w:cols w:space="720"/>
+      <w:docGrid w:linePitch="299"/>
     </w:sectPr>
   </w:body>
 </w:document>
@@ -22275,122 +20243,6 @@
         <w:color w:val="000000"/>
       </w:rPr>
     </w:pPr>
-    <w:r>
-      <w:rPr>
-        <w:noProof/>
-        <w:color w:val="000000"/>
-      </w:rPr>
-      <mc:AlternateContent>
-        <mc:Choice Requires="wps">
-          <w:drawing>
-            <wp:anchor distT="0" distB="0" distL="0" distR="0" simplePos="0" relativeHeight="251669504" behindDoc="0" locked="0" layoutInCell="1" allowOverlap="1" wp14:anchorId="3225A30D" wp14:editId="6ADC25D8">
-              <wp:simplePos x="635" y="635"/>
-              <wp:positionH relativeFrom="page">
-                <wp:align>center</wp:align>
-              </wp:positionH>
-              <wp:positionV relativeFrom="page">
-                <wp:align>bottom</wp:align>
-              </wp:positionV>
-              <wp:extent cx="622300" cy="391160"/>
-              <wp:effectExtent l="0" t="0" r="0" b="0"/>
-              <wp:wrapNone/>
-              <wp:docPr id="1134773011" name="Text Box 48" descr="OFFICIAL">
-                <a:extLst xmlns:a="http://schemas.openxmlformats.org/drawingml/2006/main">
-                  <a:ext uri="{5AE41FA2-C0FF-4470-9BD4-5FADCA87CBE2}">
-                    <aclsh:classification xmlns:aclsh="http://schemas.microsoft.com/office/drawing/2020/classificationShape" classificationOutcomeType="ftr"/>
-                  </a:ext>
-                </a:extLst>
-              </wp:docPr>
-              <wp:cNvGraphicFramePr/>
-              <a:graphic xmlns:a="http://schemas.openxmlformats.org/drawingml/2006/main">
-                <a:graphicData uri="http://schemas.microsoft.com/office/word/2010/wordprocessingShape">
-                  <wps:wsp>
-                    <wps:cNvSpPr txBox="1"/>
-                    <wps:spPr bwMode="auto">
-                      <a:xfrm>
-                        <a:off x="0" y="0"/>
-                        <a:ext cx="622300" cy="391160"/>
-                      </a:xfrm>
-                      <a:prstGeom prst="rect">
-                        <a:avLst/>
-                      </a:prstGeom>
-                      <a:noFill/>
-                      <a:ln>
-                        <a:noFill/>
-                      </a:ln>
-                    </wps:spPr>
-                    <wps:txbx>
-                      <w:txbxContent>
-                        <w:p>
-                          <w:pPr>
-                            <w:rPr>
-                              <w:rFonts w:ascii="Aptos" w:eastAsia="Aptos" w:hAnsi="Aptos" w:cs="Aptos"/>
-                              <w:noProof/>
-                              <w:color w:val="FF0000"/>
-                              <w:sz w:val="24"/>
-                            </w:rPr>
-                          </w:pPr>
-                          <w:r>
-                            <w:rPr>
-                              <w:rFonts w:ascii="Aptos" w:eastAsia="Aptos" w:hAnsi="Aptos" w:cs="Aptos"/>
-                              <w:noProof/>
-                              <w:color w:val="FF0000"/>
-                              <w:sz w:val="24"/>
-                            </w:rPr>
-                            <w:t>OFFICIAL</w:t>
-                          </w:r>
-                        </w:p>
-                      </w:txbxContent>
-                    </wps:txbx>
-                    <wps:bodyPr rot="0" spcFirstLastPara="0" vertOverflow="overflow" horzOverflow="overflow" vert="horz" wrap="none" lIns="0" tIns="0" rIns="0" bIns="190500" numCol="1" spcCol="0" rtlCol="0" fromWordArt="0" anchor="b" anchorCtr="0" forceAA="0" compatLnSpc="1">
-                      <a:prstTxWarp prst="textNoShape">
-                        <a:avLst/>
-                      </a:prstTxWarp>
-                      <a:spAutoFit/>
-                    </wps:bodyPr>
-                  </wps:wsp>
-                </a:graphicData>
-              </a:graphic>
-            </wp:anchor>
-          </w:drawing>
-        </mc:Choice>
-        <mc:Fallback>
-          <w:pict>
-            <v:shapetype w14:anchorId="3225A30D" id="_x0000_t202" coordsize="21600,21600" o:spt="202" path="m,l,21600r21600,l21600,xe">
-              <v:stroke joinstyle="miter"/>
-              <v:path gradientshapeok="t" o:connecttype="rect"/>
-            </v:shapetype>
-            <v:shape id="Text Box 48" o:spid="_x0000_s1026" type="#_x0000_t202" alt="OFFICIAL" style="position:absolute;left:0;text-align:left;margin-left:0;margin-top:0;width:49pt;height:30.8pt;z-index:251669504;visibility:visible;mso-wrap-style:none;mso-wrap-distance-left:0;mso-wrap-distance-top:0;mso-wrap-distance-right:0;mso-wrap-distance-bottom:0;mso-position-horizontal:center;mso-position-horizontal-relative:page;mso-position-vertical:bottom;mso-position-vertical-relative:page;v-text-anchor:bottom" o:gfxdata="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" filled="f" stroked="f">
-              <v:fill o:detectmouseclick="t"/>
-              <v:textbox style="mso-fit-shape-to-text:t" inset="0,0,0,15pt">
-                <w:txbxContent>
-                  <w:p>
-                    <w:pPr>
-                      <w:rPr>
-                        <w:rFonts w:ascii="Aptos" w:eastAsia="Aptos" w:hAnsi="Aptos" w:cs="Aptos"/>
-                        <w:noProof/>
-                        <w:color w:val="FF0000"/>
-                        <w:sz w:val="24"/>
-                      </w:rPr>
-                    </w:pPr>
-                    <w:r>
-                      <w:rPr>
-                        <w:rFonts w:ascii="Aptos" w:eastAsia="Aptos" w:hAnsi="Aptos" w:cs="Aptos"/>
-                        <w:noProof/>
-                        <w:color w:val="FF0000"/>
-                        <w:sz w:val="24"/>
-                      </w:rPr>
-                      <w:t>OFFICIAL</w:t>
-                    </w:r>
-                  </w:p>
-                </w:txbxContent>
-              </v:textbox>
-              <w10:wrap anchorx="page" anchory="page"/>
-            </v:shape>
-          </w:pict>
-        </mc:Fallback>
-      </mc:AlternateContent>
-    </w:r>
     <w:r>
       <w:rPr>
         <w:color w:val="000000"/>

</xml_diff>